<commit_message>
refactor(docx): fold numFmt=none heading test into unit_test_headers_numbered
</commit_message>
<xml_diff>
--- a/tests/data/docx/sources/unit_test_headers_numbered.docx
+++ b/tests/data/docx/sources/unit_test_headers_numbered.docx
@@ -667,6 +667,25 @@
       <w:proofErr w:type="spellEnd"/>
     </w:p>
     <w:p/>
+    <w:p/>
+    <w:p>
+      <w:pPr>
+        <w:pStyle w:val="HeadingInvisNum"/>
+      </w:pPr>
+      <w:r>
+        <w:t>REFERENCES</w:t>
+      </w:r>
+    </w:p>
+    <w:p>
+      <w:r>
+        <w:t>This is the first reference.</w:t>
+      </w:r>
+    </w:p>
+    <w:p>
+      <w:r>
+        <w:t>This is the second reference.</w:t>
+      </w:r>
+    </w:p>
     <w:sectPr>
       <w:pgSz w:w="12240" w:h="15840"/>
       <w:pgMar w:top="1440" w:right="1440" w:bottom="1440" w:left="1440" w:header="720" w:footer="720" w:gutter="0"/>
@@ -1541,6 +1560,17 @@
   </w:num>
   <w:num w:numId="8" w16cid:durableId="1706825683">
     <w:abstractNumId w:val="1"/>
+  </w:num>
+  <w:abstractNum w:abstractNumId="8">
+    <w:lvl w:ilvl="0">
+      <w:start w:val="1"/>
+      <w:numFmt w:val="none"/>
+      <w:lvlText w:val=""/>
+      <w:pStyle w:val="HeadingInvisNum"/>
+    </w:lvl>
+  </w:abstractNum>
+  <w:num w:numId="9">
+    <w:abstractNumId w:val="8"/>
   </w:num>
 </w:numbering>
 </file>
@@ -2533,6 +2563,17 @@
       </w:numPr>
     </w:pPr>
   </w:style>
+  <w:style w:type="paragraph" w:styleId="HeadingInvisNum">
+    <w:name w:val="heading 2 invisible num"/>
+    <w:basedOn w:val="Heading2"/>
+    <w:pPr>
+      <w:outlineLvl w:val="1"/>
+      <w:numPr>
+        <w:ilvl w:val="0"/>
+        <w:numId w:val="9"/>
+      </w:numPr>
+    </w:pPr>
+  </w:style>
 </w:styles>
 </file>
 

</xml_diff>